<commit_message>
POO S9 (Composicion y modularizacion): profundizacion rigurosa (delegacion, cohesion/acoplamiento, SRP)
</commit_message>
<xml_diff>
--- a/09-week/optional-activity/pdf/Actividad-Semana09.docx
+++ b/09-week/optional-activity/pdf/Actividad-Semana09.docx
@@ -430,7 +430,7 @@
           <w:sz w:val="22"/>
           <w:szCs w:val="22"/>
         </w:rPr>
-        <w:t xml:space="preserve">Modelar una relación "tiene-un" con composición.</w:t>
+        <w:t xml:space="preserve">Modelar una relación "tiene-un" con composición y delegación.</w:t>
       </w:r>
     </w:p>
     <w:p>
@@ -454,7 +454,7 @@
           <w:sz w:val="22"/>
           <w:szCs w:val="22"/>
         </w:rPr>
-        <w:t xml:space="preserve">Organizar las clases en paquetes.</w:t>
+        <w:t xml:space="preserve">Organizar las clases en paquetes por responsabilidad.</w:t>
       </w:r>
     </w:p>
     <w:p>
@@ -478,7 +478,7 @@
           <w:sz w:val="22"/>
           <w:szCs w:val="22"/>
         </w:rPr>
-        <w:t xml:space="preserve">Delegar comportamiento entre objetos.</w:t>
+        <w:t xml:space="preserve">Justificar la elección composición vs herencia.</w:t>
       </w:r>
     </w:p>
     <w:p>
@@ -576,7 +576,25 @@
           <w:sz w:val="22"/>
           <w:szCs w:val="22"/>
         </w:rPr>
-        <w:t xml:space="preserve"> (composición).</w:t>
+        <w:t xml:space="preserve"> (composición) en el paquete </w:t>
+      </w:r>
+      <w:r>
+        <w:rPr>
+          <w:rFonts w:ascii="Consolas" w:hAnsi="Consolas" w:cs="Consolas"/>
+          <w:color w:val="000000"/>
+          <w:sz w:val="22"/>
+          <w:szCs w:val="22"/>
+        </w:rPr>
+        <w:t xml:space="preserve">modelo</w:t>
+      </w:r>
+      <w:r>
+        <w:rPr>
+          <w:rFonts w:ascii="Times New Roman" w:hAnsi="Times New Roman" w:cs="Times New Roman"/>
+          <w:color w:val="000000"/>
+          <w:sz w:val="22"/>
+          <w:szCs w:val="22"/>
+        </w:rPr>
+        <w:t xml:space="preserve">.</w:t>
       </w:r>
     </w:p>
     <w:p>
@@ -636,7 +654,44 @@
           <w:sz w:val="22"/>
           <w:szCs w:val="22"/>
         </w:rPr>
-        <w:t xml:space="preserve"> (delega en los productos).</w:t>
+        <w:t xml:space="preserve"> </w:t>
+      </w:r>
+      <w:r>
+        <w:rPr>
+          <w:rFonts w:ascii="Times New Roman" w:hAnsi="Times New Roman" w:cs="Times New Roman"/>
+          <w:b/>
+          <w:color w:val="000000"/>
+          <w:sz w:val="22"/>
+          <w:szCs w:val="22"/>
+        </w:rPr>
+        <w:t xml:space="preserve">delegando</w:t>
+      </w:r>
+      <w:r>
+        <w:rPr>
+          <w:rFonts w:ascii="Times New Roman" w:hAnsi="Times New Roman" w:cs="Times New Roman"/>
+          <w:color w:val="000000"/>
+          <w:sz w:val="22"/>
+          <w:szCs w:val="22"/>
+        </w:rPr>
+        <w:t xml:space="preserve"> el precio a cada </w:t>
+      </w:r>
+      <w:r>
+        <w:rPr>
+          <w:rFonts w:ascii="Consolas" w:hAnsi="Consolas" w:cs="Consolas"/>
+          <w:color w:val="000000"/>
+          <w:sz w:val="22"/>
+          <w:szCs w:val="22"/>
+        </w:rPr>
+        <w:t xml:space="preserve">Producto</w:t>
+      </w:r>
+      <w:r>
+        <w:rPr>
+          <w:rFonts w:ascii="Times New Roman" w:hAnsi="Times New Roman" w:cs="Times New Roman"/>
+          <w:color w:val="000000"/>
+          <w:sz w:val="22"/>
+          <w:szCs w:val="22"/>
+        </w:rPr>
+        <w:t xml:space="preserve">.</w:t>
       </w:r>
     </w:p>
     <w:p>
@@ -660,7 +715,7 @@
           <w:sz w:val="22"/>
           <w:szCs w:val="22"/>
         </w:rPr>
-        <w:t xml:space="preserve">Organiza las clases en paquetes: </w:t>
+        <w:t xml:space="preserve">Crea </w:t>
       </w:r>
       <w:r>
         <w:rPr>
@@ -669,16 +724,16 @@
           <w:sz w:val="22"/>
           <w:szCs w:val="22"/>
         </w:rPr>
-        <w:t xml:space="preserve">modelo</w:t>
-      </w:r>
-      <w:r>
-        <w:rPr>
-          <w:rFonts w:ascii="Times New Roman" w:hAnsi="Times New Roman" w:cs="Times New Roman"/>
-          <w:color w:val="000000"/>
-          <w:sz w:val="22"/>
-          <w:szCs w:val="22"/>
-        </w:rPr>
-        <w:t xml:space="preserve"> (Producto, Pedido) y </w:t>
+        <w:t xml:space="preserve">PedidoService</w:t>
+      </w:r>
+      <w:r>
+        <w:rPr>
+          <w:rFonts w:ascii="Times New Roman" w:hAnsi="Times New Roman" w:cs="Times New Roman"/>
+          <w:color w:val="000000"/>
+          <w:sz w:val="22"/>
+          <w:szCs w:val="22"/>
+        </w:rPr>
+        <w:t xml:space="preserve"> (paquete </w:t>
       </w:r>
       <w:r>
         <w:rPr>
@@ -687,16 +742,16 @@
           <w:sz w:val="22"/>
           <w:szCs w:val="22"/>
         </w:rPr>
-        <w:t xml:space="preserve">app</w:t>
-      </w:r>
-      <w:r>
-        <w:rPr>
-          <w:rFonts w:ascii="Times New Roman" w:hAnsi="Times New Roman" w:cs="Times New Roman"/>
-          <w:color w:val="000000"/>
-          <w:sz w:val="22"/>
-          <w:szCs w:val="22"/>
-        </w:rPr>
-        <w:t xml:space="preserve"> (Main).</w:t>
+        <w:t xml:space="preserve">servicio</w:t>
+      </w:r>
+      <w:r>
+        <w:rPr>
+          <w:rFonts w:ascii="Times New Roman" w:hAnsi="Times New Roman" w:cs="Times New Roman"/>
+          <w:color w:val="000000"/>
+          <w:sz w:val="22"/>
+          <w:szCs w:val="22"/>
+        </w:rPr>
+        <w:t xml:space="preserve">) que aplique un descuento y calcule el total final (lógica de negocio separada del modelo).</w:t>
       </w:r>
     </w:p>
     <w:p>
@@ -715,30 +770,101 @@
       </w:r>
       <w:r>
         <w:rPr>
-          <w:rFonts w:ascii="Times New Roman" w:hAnsi="Times New Roman" w:cs="Times New Roman"/>
-          <w:color w:val="000000"/>
-          <w:sz w:val="22"/>
-          <w:szCs w:val="22"/>
-        </w:rPr>
-        <w:t xml:space="preserve">En </w:t>
-      </w:r>
-      <w:r>
-        <w:rPr>
           <w:rFonts w:ascii="Consolas" w:hAnsi="Consolas" w:cs="Consolas"/>
           <w:color w:val="000000"/>
           <w:sz w:val="22"/>
           <w:szCs w:val="22"/>
         </w:rPr>
-        <w:t xml:space="preserve">main</w:t>
-      </w:r>
-      <w:r>
-        <w:rPr>
-          <w:rFonts w:ascii="Times New Roman" w:hAnsi="Times New Roman" w:cs="Times New Roman"/>
-          <w:color w:val="000000"/>
-          <w:sz w:val="22"/>
-          <w:szCs w:val="22"/>
-        </w:rPr>
-        <w:t xml:space="preserve">, crea un pedido con 3 productos y muestra el total.</w:t>
+        <w:t xml:space="preserve">Main</w:t>
+      </w:r>
+      <w:r>
+        <w:rPr>
+          <w:rFonts w:ascii="Times New Roman" w:hAnsi="Times New Roman" w:cs="Times New Roman"/>
+          <w:color w:val="000000"/>
+          <w:sz w:val="22"/>
+          <w:szCs w:val="22"/>
+        </w:rPr>
+        <w:t xml:space="preserve"> (paquete </w:t>
+      </w:r>
+      <w:r>
+        <w:rPr>
+          <w:rFonts w:ascii="Consolas" w:hAnsi="Consolas" w:cs="Consolas"/>
+          <w:color w:val="000000"/>
+          <w:sz w:val="22"/>
+          <w:szCs w:val="22"/>
+        </w:rPr>
+        <w:t xml:space="preserve">app</w:t>
+      </w:r>
+      <w:r>
+        <w:rPr>
+          <w:rFonts w:ascii="Times New Roman" w:hAnsi="Times New Roman" w:cs="Times New Roman"/>
+          <w:color w:val="000000"/>
+          <w:sz w:val="22"/>
+          <w:szCs w:val="22"/>
+        </w:rPr>
+        <w:t xml:space="preserve">) crea un pedido con 3 productos y usa el servicio.</w:t>
+      </w:r>
+    </w:p>
+    <w:p>
+      <w:pPr>
+        <w:spacing w:after="120" w:line="276" w:lineRule="auto"/>
+        <w:ind w:left="454" w:hanging="284"/>
+      </w:pPr>
+      <w:r>
+        <w:rPr>
+          <w:rFonts w:ascii="Times New Roman" w:hAnsi="Times New Roman" w:cs="Times New Roman"/>
+          <w:color w:val="000000"/>
+          <w:sz w:val="22"/>
+          <w:szCs w:val="22"/>
+        </w:rPr>
+        <w:t xml:space="preserve">5.	</w:t>
+      </w:r>
+      <w:r>
+        <w:rPr>
+          <w:rFonts w:ascii="Times New Roman" w:hAnsi="Times New Roman" w:cs="Times New Roman"/>
+          <w:color w:val="000000"/>
+          <w:sz w:val="22"/>
+          <w:szCs w:val="22"/>
+        </w:rPr>
+        <w:t xml:space="preserve">En el README: justifica por qué usaste </w:t>
+      </w:r>
+      <w:r>
+        <w:rPr>
+          <w:rFonts w:ascii="Times New Roman" w:hAnsi="Times New Roman" w:cs="Times New Roman"/>
+          <w:b/>
+          <w:color w:val="000000"/>
+          <w:sz w:val="22"/>
+          <w:szCs w:val="22"/>
+        </w:rPr>
+        <w:t xml:space="preserve">composición</w:t>
+      </w:r>
+      <w:r>
+        <w:rPr>
+          <w:rFonts w:ascii="Times New Roman" w:hAnsi="Times New Roman" w:cs="Times New Roman"/>
+          <w:color w:val="000000"/>
+          <w:sz w:val="22"/>
+          <w:szCs w:val="22"/>
+        </w:rPr>
+        <w:t xml:space="preserve"> (no herencia) y dónde lograste </w:t>
+      </w:r>
+      <w:r>
+        <w:rPr>
+          <w:rFonts w:ascii="Times New Roman" w:hAnsi="Times New Roman" w:cs="Times New Roman"/>
+          <w:b/>
+          <w:color w:val="000000"/>
+          <w:sz w:val="22"/>
+          <w:szCs w:val="22"/>
+        </w:rPr>
+        <w:t xml:space="preserve">alta cohesión / bajo acoplamiento</w:t>
+      </w:r>
+      <w:r>
+        <w:rPr>
+          <w:rFonts w:ascii="Times New Roman" w:hAnsi="Times New Roman" w:cs="Times New Roman"/>
+          <w:color w:val="000000"/>
+          <w:sz w:val="22"/>
+          <w:szCs w:val="22"/>
+        </w:rPr>
+        <w:t xml:space="preserve">.</w:t>
       </w:r>
     </w:p>
     <w:p>
@@ -781,7 +907,7 @@
           <w:sz w:val="22"/>
           <w:szCs w:val="22"/>
         </w:rPr>
-        <w:t xml:space="preserve">Composición (Pedido contiene Productos).</w:t>
+        <w:t xml:space="preserve">Composición (Pedido contiene Productos) + delegación.</w:t>
       </w:r>
     </w:p>
     <w:p>
@@ -805,7 +931,7 @@
           <w:sz w:val="22"/>
           <w:szCs w:val="22"/>
         </w:rPr>
-        <w:t xml:space="preserve">Uso de </w:t>
+        <w:t xml:space="preserve">Organización en paquetes </w:t>
       </w:r>
       <w:r>
         <w:rPr>
@@ -814,16 +940,16 @@
           <w:sz w:val="22"/>
           <w:szCs w:val="22"/>
         </w:rPr>
-        <w:t xml:space="preserve">package</w:t>
-      </w:r>
-      <w:r>
-        <w:rPr>
-          <w:rFonts w:ascii="Times New Roman" w:hAnsi="Times New Roman" w:cs="Times New Roman"/>
-          <w:color w:val="000000"/>
-          <w:sz w:val="22"/>
-          <w:szCs w:val="22"/>
-        </w:rPr>
-        <w:t xml:space="preserve"> e </w:t>
+        <w:t xml:space="preserve">modelo</w:t>
+      </w:r>
+      <w:r>
+        <w:rPr>
+          <w:rFonts w:ascii="Times New Roman" w:hAnsi="Times New Roman" w:cs="Times New Roman"/>
+          <w:color w:val="000000"/>
+          <w:sz w:val="22"/>
+          <w:szCs w:val="22"/>
+        </w:rPr>
+        <w:t xml:space="preserve">, </w:t>
       </w:r>
       <w:r>
         <w:rPr>
@@ -832,7 +958,25 @@
           <w:sz w:val="22"/>
           <w:szCs w:val="22"/>
         </w:rPr>
-        <w:t xml:space="preserve">import</w:t>
+        <w:t xml:space="preserve">servicio</w:t>
+      </w:r>
+      <w:r>
+        <w:rPr>
+          <w:rFonts w:ascii="Times New Roman" w:hAnsi="Times New Roman" w:cs="Times New Roman"/>
+          <w:color w:val="000000"/>
+          <w:sz w:val="22"/>
+          <w:szCs w:val="22"/>
+        </w:rPr>
+        <w:t xml:space="preserve">, </w:t>
+      </w:r>
+      <w:r>
+        <w:rPr>
+          <w:rFonts w:ascii="Consolas" w:hAnsi="Consolas" w:cs="Consolas"/>
+          <w:color w:val="000000"/>
+          <w:sz w:val="22"/>
+          <w:szCs w:val="22"/>
+        </w:rPr>
+        <w:t xml:space="preserve">app</w:t>
       </w:r>
       <w:r>
         <w:rPr>
@@ -865,7 +1009,31 @@
           <w:sz w:val="22"/>
           <w:szCs w:val="22"/>
         </w:rPr>
-        <w:t xml:space="preserve">Cálculo correcto del total.</w:t>
+        <w:t xml:space="preserve">Separación de responsabilidades (modelo vs lógica).</w:t>
+      </w:r>
+    </w:p>
+    <w:p>
+      <w:pPr>
+        <w:spacing w:after="120" w:line="276" w:lineRule="auto"/>
+        <w:ind w:left="454" w:hanging="284"/>
+      </w:pPr>
+      <w:r>
+        <w:rPr>
+          <w:rFonts w:ascii="Times New Roman" w:hAnsi="Times New Roman" w:cs="Times New Roman"/>
+          <w:color w:val="000000"/>
+          <w:sz w:val="22"/>
+          <w:szCs w:val="22"/>
+        </w:rPr>
+        <w:t xml:space="preserve">•	</w:t>
+      </w:r>
+      <w:r>
+        <w:rPr>
+          <w:rFonts w:ascii="Times New Roman" w:hAnsi="Times New Roman" w:cs="Times New Roman"/>
+          <w:color w:val="000000"/>
+          <w:sz w:val="22"/>
+          <w:szCs w:val="22"/>
+        </w:rPr>
+        <w:t xml:space="preserve">Justificación de diseño en el README.</w:t>
       </w:r>
     </w:p>
     <w:p>
@@ -968,7 +1136,7 @@
           <w:sz w:val="18"/>
           <w:szCs w:val="18"/>
         </w:rPr>
-        <w:t xml:space="preserve">  README.md   -&gt; estructura de paquetes + salida</w:t>
+        <w:t xml:space="preserve">  README.md          -&gt; justificacion (composicion, cohesion, acoplamiento)</w:t>
       </w:r>
     </w:p>
     <w:p>
@@ -984,7 +1152,7 @@
           <w:sz w:val="18"/>
           <w:szCs w:val="18"/>
         </w:rPr>
-        <w:t xml:space="preserve">  src/modelo/  -&gt; Producto.java, Pedido.java</w:t>
+        <w:t xml:space="preserve">  src/modelo/        -&gt; Producto.java, Pedido.java</w:t>
       </w:r>
     </w:p>
     <w:p>
@@ -1000,11 +1168,27 @@
           <w:sz w:val="18"/>
           <w:szCs w:val="18"/>
         </w:rPr>
-        <w:t xml:space="preserve">  src/app/     -&gt; Main.java</w:t>
+        <w:t xml:space="preserve">  src/servicio/      -&gt; PedidoService.java</w:t>
       </w:r>
     </w:p>
     <w:p>
       <w:pPr>
+        <w:spacing w:after="0" w:line="276" w:lineRule="auto"/>
+        <w:ind w:left="120"/>
+        <w:shd w:val="clear" w:color="auto" w:fill="F0F4F4"/>
+      </w:pPr>
+      <w:r>
+        <w:rPr>
+          <w:rFonts w:ascii="Consolas" w:hAnsi="Consolas" w:cs="Consolas"/>
+          <w:color w:val="2C3E50"/>
+          <w:sz w:val="18"/>
+          <w:szCs w:val="18"/>
+        </w:rPr>
+        <w:t xml:space="preserve">  src/app/           -&gt; Main.java</w:t>
+      </w:r>
+    </w:p>
+    <w:p>
+      <w:pPr>
         <w:spacing w:after="120" w:line="276" w:lineRule="auto"/>
         <w:ind w:left="454" w:hanging="284"/>
       </w:pPr>
@@ -1024,7 +1208,7 @@
           <w:sz w:val="22"/>
           <w:szCs w:val="22"/>
         </w:rPr>
-        <w:t xml:space="preserve">Crea el repo público con ese nombre.</w:t>
+        <w:t xml:space="preserve">Crea el repositorio público con ese nombre.</w:t>
       </w:r>
     </w:p>
     <w:p>
@@ -1072,7 +1256,7 @@
           <w:sz w:val="22"/>
           <w:szCs w:val="22"/>
         </w:rPr>
-        <w:t xml:space="preserve">Comparte el enlace por el canal indicado.</w:t>
+        <w:t xml:space="preserve">Comparte el enlace por el canal indicado por el docente.</w:t>
       </w:r>
     </w:p>
     <w:p>
@@ -1155,7 +1339,7 @@
                 <w:sz w:val="20"/>
                 <w:szCs w:val="20"/>
               </w:rPr>
-              <w:t xml:space="preserve">Excelente</w:t>
+              <w:t xml:space="preserve">Excelente (100%)</w:t>
             </w:r>
           </w:p>
         </w:tc>
@@ -1177,7 +1361,7 @@
                 <w:sz w:val="20"/>
                 <w:szCs w:val="20"/>
               </w:rPr>
-              <w:t xml:space="preserve">Aceptable</w:t>
+              <w:t xml:space="preserve">Aceptable (60%)</w:t>
             </w:r>
           </w:p>
         </w:tc>
@@ -1199,7 +1383,7 @@
                 <w:sz w:val="20"/>
                 <w:szCs w:val="20"/>
               </w:rPr>
-              <w:t xml:space="preserve">Por mejorar</w:t>
+              <w:t xml:space="preserve">Por mejorar (0%)</w:t>
             </w:r>
           </w:p>
         </w:tc>
@@ -1243,7 +1427,7 @@
                 <w:sz w:val="20"/>
                 <w:szCs w:val="20"/>
               </w:rPr>
-              <w:t xml:space="preserve">Composición (Pedido↔Producto)</w:t>
+              <w:t xml:space="preserve">Composición + delegación</w:t>
             </w:r>
           </w:p>
         </w:tc>
@@ -1263,7 +1447,7 @@
                 <w:sz w:val="20"/>
                 <w:szCs w:val="20"/>
               </w:rPr>
-              <w:t xml:space="preserve">Correcta</w:t>
+              <w:t xml:space="preserve">Correctas</w:t>
             </w:r>
           </w:p>
         </w:tc>
@@ -1303,7 +1487,7 @@
                 <w:sz w:val="20"/>
                 <w:szCs w:val="20"/>
               </w:rPr>
-              <w:t xml:space="preserve">Falla</w:t>
+              <w:t xml:space="preserve">Fallan</w:t>
             </w:r>
           </w:p>
         </w:tc>
@@ -1323,7 +1507,7 @@
                 <w:sz w:val="20"/>
                 <w:szCs w:val="20"/>
               </w:rPr>
-              <w:t xml:space="preserve">35</w:t>
+              <w:t xml:space="preserve">30</w:t>
             </w:r>
           </w:p>
         </w:tc>
@@ -1365,7 +1549,7 @@
                 <w:sz w:val="20"/>
                 <w:szCs w:val="20"/>
               </w:rPr>
-              <w:t xml:space="preserve">Correcta</w:t>
+              <w:t xml:space="preserve">Correcta y coherente</w:t>
             </w:r>
           </w:p>
         </w:tc>
@@ -1425,7 +1609,7 @@
                 <w:sz w:val="20"/>
                 <w:szCs w:val="20"/>
               </w:rPr>
-              <w:t xml:space="preserve">30</w:t>
+              <w:t xml:space="preserve">25</w:t>
             </w:r>
           </w:p>
         </w:tc>
@@ -1447,7 +1631,7 @@
                 <w:sz w:val="20"/>
                 <w:szCs w:val="20"/>
               </w:rPr>
-              <w:t xml:space="preserve">total() (delegación)</w:t>
+              <w:t xml:space="preserve">Cohesión / acoplamiento (separación)</w:t>
             </w:r>
           </w:p>
         </w:tc>
@@ -1467,7 +1651,7 @@
                 <w:sz w:val="20"/>
                 <w:szCs w:val="20"/>
               </w:rPr>
-              <w:t xml:space="preserve">Correcto</w:t>
+              <w:t xml:space="preserve">Bien lograda y explicada</w:t>
             </w:r>
           </w:p>
         </w:tc>
@@ -1487,7 +1671,7 @@
                 <w:sz w:val="20"/>
                 <w:szCs w:val="20"/>
               </w:rPr>
-              <w:t xml:space="preserve">Con detalles</w:t>
+              <w:t xml:space="preserve">Parcial</w:t>
             </w:r>
           </w:p>
         </w:tc>
@@ -1507,7 +1691,7 @@
                 <w:sz w:val="20"/>
                 <w:szCs w:val="20"/>
               </w:rPr>
-              <w:t xml:space="preserve">Falla</w:t>
+              <w:t xml:space="preserve">Ausente</w:t>
             </w:r>
           </w:p>
         </w:tc>
@@ -1527,7 +1711,7 @@
                 <w:sz w:val="20"/>
                 <w:szCs w:val="20"/>
               </w:rPr>
-              <w:t xml:space="preserve">20</w:t>
+              <w:t xml:space="preserve">25</w:t>
             </w:r>
           </w:p>
         </w:tc>
@@ -1549,7 +1733,7 @@
                 <w:sz w:val="20"/>
                 <w:szCs w:val="20"/>
               </w:rPr>
-              <w:t xml:space="preserve">README y repositorio</w:t>
+              <w:t xml:space="preserve">total() con descuento + README</w:t>
             </w:r>
           </w:p>
         </w:tc>
@@ -1569,7 +1753,7 @@
                 <w:sz w:val="20"/>
                 <w:szCs w:val="20"/>
               </w:rPr>
-              <w:t xml:space="preserve">Ordenado</w:t>
+              <w:t xml:space="preserve">Correcto y claro</w:t>
             </w:r>
           </w:p>
         </w:tc>
@@ -1629,7 +1813,7 @@
                 <w:sz w:val="20"/>
                 <w:szCs w:val="20"/>
               </w:rPr>
-              <w:t xml:space="preserve">15</w:t>
+              <w:t xml:space="preserve">20</w:t>
             </w:r>
           </w:p>
         </w:tc>
@@ -1648,7 +1832,7 @@
           <w:sz w:val="21"/>
           <w:szCs w:val="21"/>
         </w:rPr>
-        <w:t xml:space="preserve">Nota: actividad formativa y opcional (sin nota en Moodle). La guía unificada de entrega estará en el Manual de Entrega de Actividades Opcionales (próximamente).</w:t>
+        <w:t xml:space="preserve">Nota: actividad formativa y opcional (sin nota en Moodle). La guía unificada para entregar todas las actividades opcionales, válida para todas las materias, estará en el Manual de Entrega de Actividades Opcionales (próximamente).</w:t>
       </w:r>
     </w:p>
     <w:sectPr>

</xml_diff>